<commit_message>
Remove seal detection and seal-mode signature layout rules
Business decision 2026-09-29: seal checking is out of scope, including
seal-mode signature/date layout rules (right-padding, offsets, centering).
Kept: signature/date existence, order, date format, blank-lines-before.

- checkers/structure.py: drop seal_expected branch from signature checker
- standardization.py: drop structural.seal_layout catalog row (36 -> 35)
- rules_schema.py, rules/common.yaml: drop seal_expected param
- docx_parser.py: drop now-unused DocModel.inline_image_count
- api.py, tests/test_api_integration.py: update note and catalog assertions
- docs and template-management.html: sync wording, keep decision records
</commit_message>
<xml_diff>
--- a/docs/技术、格式-终稿.docx
+++ b/docs/技术、格式-终稿.docx
@@ -691,165 +691,6 @@
                 <w:lang w:val="en-US" w:eastAsia="zh-CN" w:bidi="ar"/>
               </w:rPr>
               <w:t>不用模型；渲染占用 CPU 和内存，需控制并发</w:t>
-            </w:r>
-          </w:p>
-        </w:tc>
-      </w:tr>
-      <w:tr>
-        <w:tblPrEx>
-          <w:tblBorders>
-            <w:top w:val="none" w:color="auto" w:sz="0" w:space="0"/>
-            <w:left w:val="none" w:color="auto" w:sz="0" w:space="0"/>
-            <w:bottom w:val="none" w:color="auto" w:sz="0" w:space="0"/>
-            <w:right w:val="none" w:color="auto" w:sz="0" w:space="0"/>
-            <w:insideH w:val="none" w:color="auto" w:sz="0" w:space="0"/>
-            <w:insideV w:val="none" w:color="auto" w:sz="0" w:space="0"/>
-          </w:tblBorders>
-          <w:tblCellMar>
-            <w:top w:w="0" w:type="dxa"/>
-            <w:left w:w="108" w:type="dxa"/>
-            <w:bottom w:w="0" w:type="dxa"/>
-            <w:right w:w="108" w:type="dxa"/>
-          </w:tblCellMar>
-        </w:tblPrEx>
-        <w:trPr>
-          <w:trHeight w:val="626" w:hRule="atLeast"/>
-        </w:trPr>
-        <w:tc>
-          <w:tcPr>
-            <w:tcW w:w="3345" w:type="dxa"/>
-            <w:tcBorders>
-              <w:top w:val="nil"/>
-              <w:left w:val="nil"/>
-              <w:bottom w:val="nil"/>
-              <w:right w:val="nil"/>
-            </w:tcBorders>
-            <w:shd w:val="clear" w:color="auto" w:fill="auto"/>
-            <w:vAlign w:val="center"/>
-          </w:tcPr>
-          <w:p>
-            <w:pPr>
-              <w:keepNext w:val="0"/>
-              <w:keepLines w:val="0"/>
-              <w:widowControl/>
-              <w:suppressLineNumbers w:val="0"/>
-              <w:jc w:val="left"/>
-              <w:textAlignment w:val="center"/>
-              <w:rPr>
-                <w:rFonts w:hint="eastAsia" w:ascii="宋体" w:hAnsi="宋体" w:eastAsia="宋体" w:cs="宋体"/>
-                <w:i w:val="0"/>
-                <w:iCs w:val="0"/>
-                <w:color w:val="000000"/>
-                <w:sz w:val="22"/>
-                <w:szCs w:val="22"/>
-                <w:u w:val="none"/>
-              </w:rPr>
-            </w:pPr>
-            <w:r>
-              <w:rPr>
-                <w:rFonts w:hint="eastAsia" w:ascii="宋体" w:hAnsi="宋体" w:eastAsia="宋体" w:cs="宋体"/>
-                <w:i w:val="0"/>
-                <w:iCs w:val="0"/>
-                <w:color w:val="000000"/>
-                <w:kern w:val="0"/>
-                <w:sz w:val="22"/>
-                <w:szCs w:val="22"/>
-                <w:u w:val="none"/>
-                <w:lang w:val="en-US" w:eastAsia="zh-CN" w:bidi="ar"/>
-              </w:rPr>
-              <w:t>印章视觉检查（启用该规则时）</w:t>
-            </w:r>
-          </w:p>
-        </w:tc>
-        <w:tc>
-          <w:tcPr>
-            <w:tcW w:w="4269" w:type="dxa"/>
-            <w:tcBorders>
-              <w:top w:val="nil"/>
-              <w:left w:val="nil"/>
-              <w:bottom w:val="nil"/>
-              <w:right w:val="nil"/>
-            </w:tcBorders>
-            <w:shd w:val="clear" w:color="auto" w:fill="auto"/>
-            <w:vAlign w:val="center"/>
-          </w:tcPr>
-          <w:p>
-            <w:pPr>
-              <w:keepNext w:val="0"/>
-              <w:keepLines w:val="0"/>
-              <w:widowControl/>
-              <w:suppressLineNumbers w:val="0"/>
-              <w:jc w:val="left"/>
-              <w:textAlignment w:val="center"/>
-              <w:rPr>
-                <w:rFonts w:hint="eastAsia" w:ascii="宋体" w:hAnsi="宋体" w:eastAsia="宋体" w:cs="宋体"/>
-                <w:i w:val="0"/>
-                <w:iCs w:val="0"/>
-                <w:color w:val="000000"/>
-                <w:sz w:val="22"/>
-                <w:szCs w:val="22"/>
-                <w:u w:val="none"/>
-              </w:rPr>
-            </w:pPr>
-            <w:r>
-              <w:rPr>
-                <w:rFonts w:hint="eastAsia" w:ascii="宋体" w:hAnsi="宋体" w:eastAsia="宋体" w:cs="宋体"/>
-                <w:i w:val="0"/>
-                <w:iCs w:val="0"/>
-                <w:color w:val="000000"/>
-                <w:kern w:val="0"/>
-                <w:sz w:val="22"/>
-                <w:szCs w:val="22"/>
-                <w:u w:val="none"/>
-                <w:lang w:val="en-US" w:eastAsia="zh-CN" w:bidi="ar"/>
-              </w:rPr>
-              <w:t>利用审查时生成的 PDF 判断印章及其位置</w:t>
-            </w:r>
-          </w:p>
-        </w:tc>
-        <w:tc>
-          <w:tcPr>
-            <w:tcW w:w="3720" w:type="dxa"/>
-            <w:tcBorders>
-              <w:top w:val="nil"/>
-              <w:left w:val="nil"/>
-              <w:bottom w:val="nil"/>
-              <w:right w:val="nil"/>
-            </w:tcBorders>
-            <w:shd w:val="clear" w:color="auto" w:fill="auto"/>
-            <w:vAlign w:val="center"/>
-          </w:tcPr>
-          <w:p>
-            <w:pPr>
-              <w:keepNext w:val="0"/>
-              <w:keepLines w:val="0"/>
-              <w:widowControl/>
-              <w:suppressLineNumbers w:val="0"/>
-              <w:jc w:val="left"/>
-              <w:textAlignment w:val="center"/>
-              <w:rPr>
-                <w:rFonts w:hint="eastAsia" w:ascii="宋体" w:hAnsi="宋体" w:eastAsia="宋体" w:cs="宋体"/>
-                <w:i w:val="0"/>
-                <w:iCs w:val="0"/>
-                <w:color w:val="000000"/>
-                <w:sz w:val="22"/>
-                <w:szCs w:val="22"/>
-                <w:u w:val="none"/>
-              </w:rPr>
-            </w:pPr>
-            <w:r>
-              <w:rPr>
-                <w:rFonts w:hint="eastAsia" w:ascii="宋体" w:hAnsi="宋体" w:eastAsia="宋体" w:cs="宋体"/>
-                <w:i w:val="0"/>
-                <w:iCs w:val="0"/>
-                <w:color w:val="000000"/>
-                <w:kern w:val="0"/>
-                <w:sz w:val="22"/>
-                <w:szCs w:val="22"/>
-                <w:u w:val="none"/>
-                <w:lang w:val="en-US" w:eastAsia="zh-CN" w:bidi="ar"/>
-              </w:rPr>
-              <w:t>几何测量不用模型；印章身份判断可能需要 VLM</w:t>
             </w:r>
           </w:p>
         </w:tc>

</xml_diff>